<commit_message>
Fix IJMR lead package citations and declarations
</commit_message>
<xml_diff>
--- a/projects/india_patient_safety_surveillance/docs/manuscripts/target_journal_packages/ijmr_special_article_surveillance/README.docx
+++ b/projects/india_patient_safety_surveillance/docs/manuscripts/target_journal_packages/ijmr_special_article_surveillance/README.docx
@@ -2,7 +2,7 @@
 <file path=word/document.xml><?xml version="1.0" encoding="utf-8"?>
 <w:document xmlns:w="http://schemas.openxmlformats.org/wordprocessingml/2006/main" xmlns:m="http://schemas.openxmlformats.org/officeDocument/2006/math" xmlns:r="http://schemas.openxmlformats.org/officeDocument/2006/relationships" xmlns:o="urn:schemas-microsoft-com:office:office" xmlns:v="urn:schemas-microsoft-com:vml" xmlns:w10="urn:schemas-microsoft-com:office:word" xmlns:a="http://schemas.openxmlformats.org/drawingml/2006/main" xmlns:pic="http://schemas.openxmlformats.org/drawingml/2006/picture" xmlns:wp="http://schemas.openxmlformats.org/drawingml/2006/wordprocessingDrawing">
   <w:body>
-    <w:bookmarkStart w:id="21" w:name="ijmr-submission-package"/>
+    <w:bookmarkStart w:id="22" w:name="ijmr-submission-package"/>
     <w:p>
       <w:pPr>
         <w:pStyle w:val="Heading1"/>
@@ -146,7 +146,7 @@
       </w:r>
     </w:p>
     <w:bookmarkEnd w:id="10"/>
-    <w:bookmarkStart w:id="18" w:name="included-files"/>
+    <w:bookmarkStart w:id="19" w:name="included-files"/>
     <w:p>
       <w:pPr>
         <w:pStyle w:val="Heading2"/>
@@ -253,6 +253,23 @@
           <w:rPr>
             <w:rStyle w:val="Hyperlink"/>
           </w:rPr>
+          <w:t xml:space="preserve">declarations_ijmr.md</w:t>
+        </w:r>
+      </w:hyperlink>
+    </w:p>
+    <w:p>
+      <w:pPr>
+        <w:pStyle w:val="Compact"/>
+        <w:numPr>
+          <w:ilvl w:val="0"/>
+          <w:numId w:val="1003"/>
+        </w:numPr>
+      </w:pPr>
+      <w:hyperlink r:id="rId17">
+        <w:r>
+          <w:rPr>
+            <w:rStyle w:val="Hyperlink"/>
+          </w:rPr>
           <w:t xml:space="preserve">summary_table_ijmr.md</w:t>
         </w:r>
       </w:hyperlink>
@@ -265,7 +282,7 @@
           <w:numId w:val="1003"/>
         </w:numPr>
       </w:pPr>
-      <w:hyperlink r:id="rId17">
+      <w:hyperlink r:id="rId18">
         <w:r>
           <w:rPr>
             <w:rStyle w:val="Hyperlink"/>
@@ -274,8 +291,8 @@
         </w:r>
       </w:hyperlink>
     </w:p>
-    <w:bookmarkEnd w:id="18"/>
-    <w:bookmarkStart w:id="19" w:name="ijmr-guidance-verified"/>
+    <w:bookmarkEnd w:id="19"/>
+    <w:bookmarkStart w:id="20" w:name="ijmr-guidance-verified"/>
     <w:p>
       <w:pPr>
         <w:pStyle w:val="Heading2"/>
@@ -414,8 +431,8 @@
         <w:t xml:space="preserve">words</w:t>
       </w:r>
     </w:p>
-    <w:bookmarkEnd w:id="19"/>
-    <w:bookmarkStart w:id="20" w:name="package-completion-status"/>
+    <w:bookmarkEnd w:id="20"/>
+    <w:bookmarkStart w:id="21" w:name="package-completion-status"/>
     <w:p>
       <w:pPr>
         <w:pStyle w:val="Heading2"/>
@@ -504,8 +521,8 @@
         <w:t xml:space="preserve">DOCX files for direct editorial finishing</w:t>
       </w:r>
     </w:p>
-    <w:bookmarkEnd w:id="20"/>
     <w:bookmarkEnd w:id="21"/>
+    <w:bookmarkEnd w:id="22"/>
     <w:sectPr>
       <w:footnotePr>
         <w:numRestart w:val="eachSect"/>

</xml_diff>